<commit_message>
Report: use Israa University logo on the cover
Co-Authored-By: Claude Opus 5.5 <noreply@anthropic.com>
Claude-Session: https://claude.ai/code/session_01RVHqZkty1Aftyae7eJBKDt
</commit_message>
<xml_diff>
--- a/docs/report/graduation-report-reference-format.docx
+++ b/docs/report/graduation-report-reference-format.docx
@@ -16,17 +16,9 @@
             <wp:positionV relativeFrom="paragraph">
               <wp:posOffset>0</wp:posOffset>
             </wp:positionV>
-            <wp:extent cx="2762250" cy="1226850"/>
+            <wp:extent cx="1152000" cy="1152000"/>
             <wp:effectExtent l="0" t="0" r="0" b="0"/>
-            <wp:wrapTight wrapText="bothSides">
-              <wp:wrapPolygon edited="0">
-                <wp:start x="0" y="0"/>
-                <wp:lineTo x="0" y="21130"/>
-                <wp:lineTo x="21451" y="21130"/>
-                <wp:lineTo x="21451" y="0"/>
-                <wp:lineTo x="0" y="0"/>
-              </wp:wrapPolygon>
-            </wp:wrapTight>
+            <wp:wrapTopAndBottom/>
             <wp:docPr id="1" name="صورة 1"/>
             <wp:cNvGraphicFramePr>
               <a:graphicFrameLocks xmlns:a="http://schemas.openxmlformats.org/drawingml/2006/main" noChangeAspect="1"/>
@@ -53,7 +45,7 @@
                   <pic:spPr>
                     <a:xfrm>
                       <a:off x="0" y="0"/>
-                      <a:ext cx="2762250" cy="1226850"/>
+                      <a:ext cx="1152000" cy="1152000"/>
                     </a:xfrm>
                     <a:prstGeom prst="rect">
                       <a:avLst/>

</xml_diff>

<commit_message>
Report cover: reference-style header with the college logo and names
Co-Authored-By: Claude Opus 5.5 <noreply@anthropic.com>
Claude-Session: https://claude.ai/code/session_01RVHqZkty1Aftyae7eJBKDt
</commit_message>
<xml_diff>
--- a/docs/report/graduation-report-reference-format.docx
+++ b/docs/report/graduation-report-reference-format.docx
@@ -2,68 +2,193 @@
 <file path=word/document.xml><?xml version="1.0" encoding="utf-8"?>
 <w:document xmlns:wpc="http://schemas.microsoft.com/office/word/2010/wordprocessingCanvas" xmlns:mc="http://schemas.openxmlformats.org/markup-compatibility/2006" xmlns:o="urn:schemas-microsoft-com:office:office" xmlns:r="http://schemas.openxmlformats.org/officeDocument/2006/relationships" xmlns:m="http://schemas.openxmlformats.org/officeDocument/2006/math" xmlns:v="urn:schemas-microsoft-com:vml" xmlns:wp14="http://schemas.microsoft.com/office/word/2010/wordprocessingDrawing" xmlns:wp="http://schemas.openxmlformats.org/drawingml/2006/wordprocessingDrawing" xmlns:w10="urn:schemas-microsoft-com:office:word" xmlns:w="http://schemas.openxmlformats.org/wordprocessingml/2006/main" xmlns:w14="http://schemas.microsoft.com/office/word/2010/wordml" xmlns:w15="http://schemas.microsoft.com/office/word/2012/wordml" xmlns:wpg="http://schemas.microsoft.com/office/word/2010/wordprocessingGroup" xmlns:wpi="http://schemas.microsoft.com/office/word/2010/wordprocessingInk" xmlns:wne="http://schemas.microsoft.com/office/word/2006/wordml" xmlns:wps="http://schemas.microsoft.com/office/word/2010/wordprocessingShape" mc:Ignorable="w14 w15 wp14">
   <w:body>
-    <w:p>
-      <w:r>
-        <w:rPr>
-          <w:noProof/>
-        </w:rPr>
-        <w:drawing>
-          <wp:anchor distT="0" distB="0" distL="114300" distR="114300" simplePos="0" relativeHeight="251658240" behindDoc="1" locked="0" layoutInCell="1" allowOverlap="1" wp14:anchorId="3009FD5D" wp14:editId="76C0774C">
-            <wp:simplePos x="0" y="0"/>
-            <wp:positionH relativeFrom="margin">
-              <wp:align>center</wp:align>
-            </wp:positionH>
-            <wp:positionV relativeFrom="paragraph">
-              <wp:posOffset>0</wp:posOffset>
-            </wp:positionV>
-            <wp:extent cx="1152000" cy="1152000"/>
-            <wp:effectExtent l="0" t="0" r="0" b="0"/>
-            <wp:wrapTopAndBottom/>
-            <wp:docPr id="1" name="صورة 1"/>
-            <wp:cNvGraphicFramePr>
-              <a:graphicFrameLocks xmlns:a="http://schemas.openxmlformats.org/drawingml/2006/main" noChangeAspect="1"/>
-            </wp:cNvGraphicFramePr>
-            <a:graphic xmlns:a="http://schemas.openxmlformats.org/drawingml/2006/main">
-              <a:graphicData uri="http://schemas.openxmlformats.org/drawingml/2006/picture">
-                <pic:pic xmlns:pic="http://schemas.openxmlformats.org/drawingml/2006/picture">
-                  <pic:nvPicPr>
-                    <pic:cNvPr id="1" name="صورة 1"/>
-                    <pic:cNvPicPr/>
-                  </pic:nvPicPr>
-                  <pic:blipFill>
-                    <a:blip r:embed="rId5">
-                      <a:extLst>
-                        <a:ext uri="{28A0092B-C50C-407E-A947-70E740481C1C}">
-                          <a14:useLocalDpi xmlns:a14="http://schemas.microsoft.com/office/drawing/2010/main" val="0"/>
-                        </a:ext>
-                      </a:extLst>
-                    </a:blip>
-                    <a:stretch>
-                      <a:fillRect/>
-                    </a:stretch>
-                  </pic:blipFill>
-                  <pic:spPr>
-                    <a:xfrm>
-                      <a:off x="0" y="0"/>
-                      <a:ext cx="1152000" cy="1152000"/>
-                    </a:xfrm>
-                    <a:prstGeom prst="rect">
-                      <a:avLst/>
-                    </a:prstGeom>
-                  </pic:spPr>
-                </pic:pic>
-              </a:graphicData>
-            </a:graphic>
-            <wp14:sizeRelH relativeFrom="page">
-              <wp14:pctWidth>0</wp14:pctWidth>
-            </wp14:sizeRelH>
-            <wp14:sizeRelV relativeFrom="page">
-              <wp14:pctHeight>0</wp14:pctHeight>
-            </wp14:sizeRelV>
-          </wp:anchor>
-        </w:drawing>
-      </w:r>
-    </w:p>
+    <w:tbl>
+      <w:tblPr>
+        <w:bidiVisual/>
+        <w:tblW w:w="9360" w:type="dxa"/>
+        <w:tblBorders>
+          <w:top w:val="nil"/>
+          <w:left w:val="nil"/>
+          <w:bottom w:val="nil"/>
+          <w:right w:val="nil"/>
+          <w:insideH w:val="nil"/>
+          <w:insideV w:val="nil"/>
+        </w:tblBorders>
+        <w:tblLayout w:type="fixed"/>
+        <w:tblCellMar>
+          <w:left w:w="120" w:type="dxa"/>
+          <w:right w:w="120" w:type="dxa"/>
+        </w:tblCellMar>
+      </w:tblPr>
+      <w:tblGrid>
+        <w:gridCol w:w="3300"/>
+        <w:gridCol w:w="2760"/>
+        <w:gridCol w:w="3300"/>
+      </w:tblGrid>
+      <w:tr>
+        <w:tc>
+          <w:tcPr>
+            <w:tcW w:w="3300" w:type="dxa"/>
+            <w:vAlign w:val="top"/>
+          </w:tcPr>
+          <w:p>
+            <w:pPr>
+              <w:bidi/>
+              <w:spacing w:before="0" w:after="40" w:line="240" w:lineRule="auto"/>
+            </w:pPr>
+            <w:r>
+              <w:rPr>
+                <w:rFonts w:ascii="Times New Roman" w:hAnsi="Times New Roman" w:cs="Times New Roman"/>
+                <w:b/>
+                <w:bCs/>
+                <w:sz w:val="24"/>
+                <w:szCs w:val="24"/>
+                <w:rtl/>
+              </w:rPr>
+              <w:t xml:space="preserve">الكلية الجامعية للعلوم التطبيقية</w:t>
+            </w:r>
+          </w:p>
+          <w:p>
+            <w:pPr>
+              <w:bidi/>
+              <w:spacing w:before="0" w:after="40" w:line="240" w:lineRule="auto"/>
+            </w:pPr>
+            <w:r>
+              <w:rPr>
+                <w:rFonts w:ascii="Times New Roman" w:hAnsi="Times New Roman" w:cs="Times New Roman"/>
+                <w:b/>
+                <w:bCs/>
+                <w:sz w:val="24"/>
+                <w:szCs w:val="24"/>
+                <w:rtl/>
+              </w:rPr>
+              <w:t xml:space="preserve">غزة – فلسطين</w:t>
+            </w:r>
+          </w:p>
+          <w:p>
+            <w:pPr>
+              <w:bidi/>
+              <w:spacing w:before="0" w:after="40" w:line="240" w:lineRule="auto"/>
+            </w:pPr>
+            <w:r>
+              <w:rPr>
+                <w:rFonts w:ascii="Times New Roman" w:hAnsi="Times New Roman" w:cs="Times New Roman"/>
+                <w:b/>
+                <w:bCs/>
+                <w:sz w:val="24"/>
+                <w:szCs w:val="24"/>
+                <w:highlight w:val="yellow"/>
+                <w:rtl/>
+              </w:rPr>
+              <w:t xml:space="preserve">[القسم]</w:t>
+            </w:r>
+          </w:p>
+        </w:tc>
+        <w:tc>
+          <w:tcPr>
+            <w:tcW w:w="2760" w:type="dxa"/>
+            <w:vAlign w:val="center"/>
+          </w:tcPr>
+          <w:p>
+            <w:pPr>
+              <w:spacing w:before="0" w:after="0"/>
+              <w:jc w:val="center"/>
+            </w:pPr>
+            <w:r>
+              <w:drawing>
+                <wp:inline distT="0" distB="0" distL="0" distR="0">
+                  <wp:extent cx="1980000" cy="879414"/>
+                  <wp:docPr id="1" name="Logo"/>
+                  <wp:cNvGraphicFramePr>
+                    <a:graphicFrameLocks xmlns:a="http://schemas.openxmlformats.org/drawingml/2006/main" noChangeAspect="1"/>
+                  </wp:cNvGraphicFramePr>
+                  <a:graphic xmlns:a="http://schemas.openxmlformats.org/drawingml/2006/main">
+                    <a:graphicData uri="http://schemas.openxmlformats.org/drawingml/2006/picture">
+                      <pic:pic xmlns:pic="http://schemas.openxmlformats.org/drawingml/2006/picture">
+                        <pic:nvPicPr>
+                          <pic:cNvPr id="1" name="logo.jpg"/>
+                          <pic:cNvPicPr/>
+                        </pic:nvPicPr>
+                        <pic:blipFill>
+                          <a:blip r:embed="rId5"/>
+                          <a:stretch>
+                            <a:fillRect/>
+                          </a:stretch>
+                        </pic:blipFill>
+                        <pic:spPr>
+                          <a:xfrm>
+                            <a:off x="0" y="0"/>
+                            <a:ext cx="1980000" cy="879414"/>
+                          </a:xfrm>
+                          <a:prstGeom prst="rect">
+                            <a:avLst/>
+                          </a:prstGeom>
+                        </pic:spPr>
+                      </pic:pic>
+                    </a:graphicData>
+                  </a:graphic>
+                </wp:inline>
+              </w:drawing>
+            </w:r>
+          </w:p>
+        </w:tc>
+        <w:tc>
+          <w:tcPr>
+            <w:tcW w:w="3300" w:type="dxa"/>
+            <w:vAlign w:val="top"/>
+          </w:tcPr>
+          <w:p>
+            <w:pPr>
+              <w:spacing w:before="0" w:after="40" w:line="240" w:lineRule="auto"/>
+              <w:jc w:val="left"/>
+            </w:pPr>
+            <w:r>
+              <w:rPr>
+                <w:rFonts w:ascii="Times New Roman" w:hAnsi="Times New Roman" w:cs="Times New Roman"/>
+                <w:b/>
+                <w:bCs/>
+                <w:sz w:val="24"/>
+                <w:szCs w:val="24"/>
+              </w:rPr>
+              <w:t xml:space="preserve">University College of Applied Sciences</w:t>
+            </w:r>
+          </w:p>
+          <w:p>
+            <w:pPr>
+              <w:spacing w:before="0" w:after="40" w:line="240" w:lineRule="auto"/>
+              <w:jc w:val="left"/>
+            </w:pPr>
+            <w:r>
+              <w:rPr>
+                <w:rFonts w:ascii="Times New Roman" w:hAnsi="Times New Roman" w:cs="Times New Roman"/>
+                <w:b/>
+                <w:bCs/>
+                <w:sz w:val="24"/>
+                <w:szCs w:val="24"/>
+              </w:rPr>
+              <w:t xml:space="preserve">Gaza – Palestine</w:t>
+            </w:r>
+          </w:p>
+          <w:p>
+            <w:pPr>
+              <w:spacing w:before="0" w:after="40" w:line="240" w:lineRule="auto"/>
+              <w:jc w:val="left"/>
+            </w:pPr>
+            <w:r>
+              <w:rPr>
+                <w:rFonts w:ascii="Times New Roman" w:hAnsi="Times New Roman" w:cs="Times New Roman"/>
+                <w:b/>
+                <w:bCs/>
+                <w:sz w:val="24"/>
+                <w:szCs w:val="24"/>
+                <w:highlight w:val="yellow"/>
+              </w:rPr>
+              <w:t xml:space="preserve">[Department]</w:t>
+            </w:r>
+          </w:p>
+        </w:tc>
+      </w:tr>
+    </w:tbl>
     <w:p>
       <w:pPr>
         <w:rPr>

</xml_diff>

<commit_message>
Report cover: round college logo in the reference style
Co-Authored-By: Claude Opus 5.5 <noreply@anthropic.com>
Claude-Session: https://claude.ai/code/session_01RVHqZkty1Aftyae7eJBKDt
</commit_message>
<xml_diff>
--- a/docs/report/graduation-report-reference-format.docx
+++ b/docs/report/graduation-report-reference-format.docx
@@ -97,7 +97,7 @@
             <w:r>
               <w:drawing>
                 <wp:inline distT="0" distB="0" distL="0" distR="0">
-                  <wp:extent cx="1980000" cy="879414"/>
+                  <wp:extent cx="1152000" cy="1152000"/>
                   <wp:docPr id="1" name="Logo"/>
                   <wp:cNvGraphicFramePr>
                     <a:graphicFrameLocks xmlns:a="http://schemas.openxmlformats.org/drawingml/2006/main" noChangeAspect="1"/>
@@ -118,7 +118,7 @@
                         <pic:spPr>
                           <a:xfrm>
                             <a:off x="0" y="0"/>
-                            <a:ext cx="1980000" cy="879414"/>
+                            <a:ext cx="1152000" cy="1152000"/>
                           </a:xfrm>
                           <a:prstGeom prst="rect">
                             <a:avLst/>

</xml_diff>